<commit_message>
TRD-EHR paper 1: Figure 4 is all four encoders in one 2x2 sweep figure, best k a diamond and each panel titled with its embedding width; the dimension scatters move to Supplement S6 as Figures S10-S11, the second new, as a share of each encoder's width, and old S10-S15 become S12-S17; Results gain their own Subgroup Performance section with Figure 5, every contrast surviving Benjamini-Hochberg, discrimination only; the feature arm's subgroup stand-in is XGBoost; Discussion gains Interpreting Nearest-Neighbor Retrieval from Martin's note, citing NCA and Cawley and Talbot; Forthman is third author; Acknowledgments name Claude; reference DOIs and Nature issue corrected; exports carry the two new figures; packet and parts rebuilt
</commit_message>
<xml_diff>
--- a/projects/TRD-EHR/paper1-trd-prediction/manuscript.docx
+++ b/projects/TRD-EHR/paper1-trd-prediction/manuscript.docx
@@ -2,7 +2,7 @@
 <file path=word/document.xml><?xml version="1.0" encoding="utf-8"?>
 <w:document xmlns:w="http://schemas.openxmlformats.org/wordprocessingml/2006/main" xmlns:m="http://schemas.openxmlformats.org/officeDocument/2006/math" xmlns:r="http://schemas.openxmlformats.org/officeDocument/2006/relationships" xmlns:o="urn:schemas-microsoft-com:office:office" xmlns:v="urn:schemas-microsoft-com:vml" xmlns:w10="urn:schemas-microsoft-com:office:word" xmlns:a="http://schemas.openxmlformats.org/drawingml/2006/main" xmlns:pic="http://schemas.openxmlformats.org/drawingml/2006/picture" xmlns:wp="http://schemas.openxmlformats.org/drawingml/2006/wordprocessingDrawing">
   <w:body>
-    <w:bookmarkStart w:id="11" w:name="_40b5b020fd3b163194746b13251c26ddcb1f3bb"/>
+    <w:bookmarkStart w:id="22" w:name="title-page"/>
     <w:p>
       <w:pPr>
         <w:pStyle w:val="Heading1"/>
@@ -34,7 +34,7 @@
         <w:pStyle w:val="BodyText"/>
       </w:pPr>
       <w:r>
-        <w:t xml:space="preserve">Mikey Ferguson, BS¹; Martin Paulus, MD¹; Rayus Kuplicki, PhD¹; Katherine L. Forthman, MS¹; Dale Peasley, MS¹; Sandip Sen, PhD²</w:t>
+        <w:t xml:space="preserve">Mikey Ferguson, BS¹; Martin Paulus, MD¹; Katherine L. Forthman, MS¹; Rayus Kuplicki, PhD¹; Dale Peasley, MS¹; Sandip Sen, PhD²</w:t>
       </w:r>
     </w:p>
     <w:p>
@@ -51,7 +51,7 @@
         <w:t xml:space="preserve">² The University of Tulsa, Tulsa, Oklahoma, United States</w:t>
       </w:r>
     </w:p>
-    <w:bookmarkStart w:id="9" w:name="_4373836a783208412a1aff48a59a240a1ad8afd"/>
+    <w:bookmarkStart w:id="20" w:name="corresponding-author"/>
     <w:p>
       <w:pPr>
         <w:pStyle w:val="Heading2"/>
@@ -92,8 +92,8 @@
         <w:t xml:space="preserve">ORCID: 0009-0005-1365-5609</w:t>
       </w:r>
     </w:p>
-    <w:bookmarkEnd w:id="9"/>
-    <w:bookmarkStart w:id="10" w:name="_7eec2310df51d7a7ec282d98e9d728fd111ee0d"/>
+    <w:bookmarkEnd w:id="20"/>
+    <w:bookmarkStart w:id="21" w:name="author-orcids"/>
     <w:p>
       <w:pPr>
         <w:pStyle w:val="Heading2"/>
@@ -123,6 +123,14 @@
         <w:pStyle w:val="BodyText"/>
       </w:pPr>
       <w:r>
+        <w:t xml:space="preserve">Katherine L. Forthman 0000-0002-8695-8388</w:t>
+      </w:r>
+    </w:p>
+    <w:p>
+      <w:pPr>
+        <w:pStyle w:val="BodyText"/>
+      </w:pPr>
+      <w:r>
         <w:t xml:space="preserve">Rayus Kuplicki 0000-0003-2954-6421</w:t>
       </w:r>
     </w:p>
@@ -131,14 +139,6 @@
         <w:pStyle w:val="BodyText"/>
       </w:pPr>
       <w:r>
-        <w:t xml:space="preserve">Katherine L. Forthman 0000-0002-8695-8388</w:t>
-      </w:r>
-    </w:p>
-    <w:p>
-      <w:pPr>
-        <w:pStyle w:val="BodyText"/>
-      </w:pPr>
-      <w:r>
         <w:t xml:space="preserve">Dale Peasley 0009-0003-7696-595X</w:t>
       </w:r>
     </w:p>
@@ -150,9 +150,9 @@
         <w:t xml:space="preserve">Sandip Sen 0000-0001-6107-4095</w:t>
       </w:r>
     </w:p>
-    <w:bookmarkEnd w:id="10"/>
-    <w:bookmarkEnd w:id="11"/>
-    <w:bookmarkStart w:id="12" w:name="_abstract"/>
+    <w:bookmarkEnd w:id="21"/>
+    <w:bookmarkEnd w:id="22"/>
+    <w:bookmarkStart w:id="23" w:name="abstract"/>
     <w:p>
       <w:pPr>
         <w:pStyle w:val="Heading1"/>
@@ -259,8 +259,8 @@
         <w:t xml:space="preserve">Keywords: treatment-resistant depression; depression; electronic health records; machine learning; clinical prediction; text embeddings; antidepressants</w:t>
       </w:r>
     </w:p>
-    <w:bookmarkEnd w:id="12"/>
-    <w:bookmarkStart w:id="13" w:name="_introduction"/>
+    <w:bookmarkEnd w:id="23"/>
+    <w:bookmarkStart w:id="24" w:name="introduction"/>
     <w:p>
       <w:pPr>
         <w:pStyle w:val="Heading1"/>
@@ -309,8 +309,8 @@
         <w:t xml:space="preserve">We asked whether pretrained embeddings of rule-based patient narratives improve prediction of a treatment-switching proxy for TRD beyond structured feature vectors at the index antidepressant prescription. We compared the pipelines in the same patients, using a common temporal design and test set. Secondary analyses examined whether performance depended on the classifier or encoder, which clinical domains contributed, and whether embedding similarity supported prediction.</w:t>
       </w:r>
     </w:p>
-    <w:bookmarkEnd w:id="13"/>
-    <w:bookmarkStart w:id="24" w:name="_methods"/>
+    <w:bookmarkEnd w:id="24"/>
+    <w:bookmarkStart w:id="35" w:name="methods"/>
     <w:p>
       <w:pPr>
         <w:pStyle w:val="Heading1"/>
@@ -319,7 +319,7 @@
         <w:t xml:space="preserve">Methods</w:t>
       </w:r>
     </w:p>
-    <w:bookmarkStart w:id="14" w:name="_49e275e0513b8e1e92cbc33a2b96fdd1a4287bf"/>
+    <w:bookmarkStart w:id="25" w:name="study-design-and-data-source"/>
     <w:p>
       <w:pPr>
         <w:pStyle w:val="Heading2"/>
@@ -344,8 +344,8 @@
         <w:t xml:space="preserve">We used data version DV260629v1 and patient version PV260710v1, extracted on June 29, 2026, and processed on July 10, 2026. Index dates spanned 2013–2025. Evaluation used a random internal split from the same source and period. Source definitions and sampling details are provided in Multimedia Appendix 1, sections M1–M2. We used TRIPOD+AI to guide reporting [19].</w:t>
       </w:r>
     </w:p>
-    <w:bookmarkEnd w:id="14"/>
-    <w:bookmarkStart w:id="18" w:name="_f2dd39f973457dd42f3db9d2cfa3214359c7119"/>
+    <w:bookmarkEnd w:id="25"/>
+    <w:bookmarkStart w:id="29" w:name="participants-and-prediction-time"/>
     <w:p>
       <w:pPr>
         <w:pStyle w:val="Heading2"/>
@@ -379,18 +379,18 @@
           <wp:inline>
             <wp:extent cx="5486400" cy="2560320"/>
             <wp:effectExtent b="0" l="0" r="0" t="0"/>
-            <wp:docPr descr="" title="" id="16" name="Picture"/>
+            <wp:docPr descr="" title="" id="27" name="Picture"/>
             <a:graphic>
               <a:graphicData uri="http://schemas.openxmlformats.org/drawingml/2006/picture">
                 <pic:pic>
                   <pic:nvPicPr>
-                    <pic:cNvPr descr="../exports/results/Qwen-Qwen3-Embedding-8B/google_medgemma-27b-text-it/time_zero_timeline.png" id="17" name="Picture"/>
+                    <pic:cNvPr descr="../results/Qwen-Qwen3-Embedding-8B/google_medgemma-27b-text-it/time_zero_timeline.png" id="28" name="Picture"/>
                     <pic:cNvPicPr>
                       <a:picLocks noChangeArrowheads="1" noChangeAspect="1"/>
                     </pic:cNvPicPr>
                   </pic:nvPicPr>
                   <pic:blipFill>
-                    <a:blip r:embed="rId15"/>
+                    <a:blip r:embed="rId26"/>
                     <a:stretch>
                       <a:fillRect/>
                     </a:stretch>
@@ -445,8 +445,8 @@
         <w:t xml:space="preserve">Prediction time and observation windows. The index is the earliest antidepressant prescription on or after the first recorded depression diagnosis. Clinical content comes from the preceding 730 days through the index date. Total recorded pre-index history length is a separate duration predictor and can exceed this window. The subsequent 365 days establish follow-up eligibility and the treatment-switching outcome. For 25,645 of the 42,579 patients (60.2%, 95% CI 59.8–60.7), the index prescription was written on the same day as the first depression diagnosis. EHR: electronic health record; MDD: major depressive disorder; TRD: treatment-resistant depression proxy.</w:t>
       </w:r>
     </w:p>
-    <w:bookmarkEnd w:id="18"/>
-    <w:bookmarkStart w:id="19" w:name="_outcome"/>
+    <w:bookmarkEnd w:id="29"/>
+    <w:bookmarkStart w:id="30" w:name="outcome"/>
     <w:p>
       <w:pPr>
         <w:pStyle w:val="Heading2"/>
@@ -483,8 +483,8 @@
         <w:t xml:space="preserve">rather than TRD.</w:t>
       </w:r>
     </w:p>
-    <w:bookmarkEnd w:id="19"/>
-    <w:bookmarkStart w:id="20" w:name="_bc2ecf9ae28c51bfb04f261c78498a3323eb498"/>
+    <w:bookmarkEnd w:id="30"/>
+    <w:bookmarkStart w:id="31" w:name="patient-representations-and-missing-data"/>
     <w:p>
       <w:pPr>
         <w:pStyle w:val="Heading2"/>
@@ -517,8 +517,8 @@
         <w:t xml:space="preserve">The pipelines differed in information content. Narratives retained vital signs, individual medication names, index dates, sexual orientation, and finer sociodemographic categories; FEATURE included total recorded history length, which the narratives omitted. Missing vital signs were excluded from FEATURE, and no statistical imputation was used in the primary analysis. Missing categorical information was represented explicitly, although some narrative fields retained raw missing-value tokens. Encoding rules, the predictor inventory, example narratives, and the field crosswalk are provided in Multimedia Appendix 1, sections M4–M6, S5, and S10.</w:t>
       </w:r>
     </w:p>
-    <w:bookmarkEnd w:id="20"/>
-    <w:bookmarkStart w:id="21" w:name="_5f61c62670e39b803565c99f58f9215be61faf5"/>
+    <w:bookmarkEnd w:id="31"/>
+    <w:bookmarkStart w:id="32" w:name="model-development-and-evaluation"/>
     <w:p>
       <w:pPr>
         <w:pStyle w:val="Heading2"/>
@@ -551,8 +551,8 @@
         <w:t xml:space="preserve">95% CIs came from resampling the test patients with replacement (the bootstrap). A difference between 2 models used the same resampled patients for both, which is called a paired bootstrap. We compared the representations in 2 ways. First, each classifier on embeddings was compared with the same classifier on feature vectors. Second, the best embedded model was compared with the best feature-vector model. Those 2 models were picked after seeing their test results, so the second comparison was not planned in advance. We set no margin for calling 2 models equivalent, so an interval that includes zero means no difference was found, not that the models are the same. Sensitivity and specificity at the threshold that maximized their sum in the test patients are given in Multimedia Appendix 1, section S12, as descriptions only.</w:t>
       </w:r>
     </w:p>
-    <w:bookmarkEnd w:id="21"/>
-    <w:bookmarkStart w:id="22" w:name="_cc823ed83dc5ec31f8d38080373b9a0a736c5b0"/>
+    <w:bookmarkEnd w:id="32"/>
+    <w:bookmarkStart w:id="33" w:name="supporting-analyses"/>
     <w:p>
       <w:pPr>
         <w:pStyle w:val="Heading2"/>
@@ -1522,11 +1522,11 @@
         <w:pStyle w:val="BodyText"/>
       </w:pPr>
       <w:r>
-        <w:t xml:space="preserve">Additional analyses examined encoder robustness, model dimensionality, record length, and subgroup performance. Subgroup comparisons used held-out predictions without refitting and Benjamini–Hochberg adjustment across 240 contrasts. Full methods and results appear in Multimedia Appendix 1. All random processes were seeded; analyses used Python, scikit-learn, XGBoost, and sentence-transformers [22,26,27].</w:t>
-      </w:r>
-    </w:p>
-    <w:bookmarkEnd w:id="22"/>
-    <w:bookmarkStart w:id="23" w:name="_2167f12c33b4c5bf55da6a4c284c297820adfc8"/>
+        <w:t xml:space="preserve">Additional analyses examined encoder robustness, model dimensionality, record length, and subgroup performance. Subgroup comparisons, for the primary encoder, used held-out predictions without refitting and Benjamini–Hochberg adjustment across 240 contrasts. Full methods and results appear in Multimedia Appendix 1. All random processes were seeded; analyses used Python, scikit-learn, XGBoost, and sentence-transformers [22,26,27].</w:t>
+      </w:r>
+    </w:p>
+    <w:bookmarkEnd w:id="33"/>
+    <w:bookmarkStart w:id="34" w:name="ethical-considerations"/>
     <w:p>
       <w:pPr>
         <w:pStyle w:val="Heading2"/>
@@ -1543,9 +1543,9 @@
         <w:t xml:space="preserve">We analyzed deidentified secondary records without direct identifiers. No institutional review board review or consent waiver was obtained because the study was considered not to involve human participants. All analytic computation, including embedding, ran on local institutional hardware; patient-level analytic data were not transmitted to external services. No patients or members of the public participated in the design, conduct, or reporting of the study.</w:t>
       </w:r>
     </w:p>
-    <w:bookmarkEnd w:id="23"/>
-    <w:bookmarkEnd w:id="24"/>
-    <w:bookmarkStart w:id="45" w:name="_results"/>
+    <w:bookmarkEnd w:id="34"/>
+    <w:bookmarkEnd w:id="35"/>
+    <w:bookmarkStart w:id="54" w:name="results"/>
     <w:p>
       <w:pPr>
         <w:pStyle w:val="Heading1"/>
@@ -1554,7 +1554,7 @@
         <w:t xml:space="preserve">Results</w:t>
       </w:r>
     </w:p>
-    <w:bookmarkStart w:id="25" w:name="_05544cad0514f6a68575f9a3bde29a58fbe80a2"/>
+    <w:bookmarkStart w:id="36" w:name="cohort-characteristics"/>
     <w:p>
       <w:pPr>
         <w:pStyle w:val="Heading2"/>
@@ -2691,14 +2691,14 @@
     </w:tbl>
     <w:p>
       <w:pPr>
-        <w:pStyle w:val="FirstParagraph"/>
+        <w:pStyle w:val="BodyText"/>
       </w:pPr>
       <w:r>
         <w:t xml:space="preserve">Training and test characteristics were closely balanced (maximum absolute standardized mean difference 0.036). Weak negative correlations linked the outcome to history length, encounter count, and time from depression diagnosis to the index prescription. These descriptive checks do not exclude effects of observation or care access (Multimedia Appendix 1, sections S7–S8).</w:t>
       </w:r>
     </w:p>
-    <w:bookmarkEnd w:id="25"/>
-    <w:bookmarkStart w:id="29" w:name="_4af3dff24012ff8b532b70fa2af7ea2376fc878"/>
+    <w:bookmarkEnd w:id="36"/>
+    <w:bookmarkStart w:id="40" w:name="discrimination-and-calibration"/>
     <w:p>
       <w:pPr>
         <w:pStyle w:val="Heading2"/>
@@ -3296,7 +3296,7 @@
     </w:tbl>
     <w:p>
       <w:pPr>
-        <w:pStyle w:val="FirstParagraph"/>
+        <w:pStyle w:val="BodyText"/>
       </w:pPr>
       <w:r>
         <w:t xml:space="preserve">The direction of the representation difference depended on the classifier. Embeddings improved logistic regression by 0.028 ROC AUC (95% CI 0.017–0.039), but reduced performance for random forest by 0.022 (95% CI 0.011–0.033), gradient boosting by 0.013 (95% CI 0.001–0.026), and XGBoost by 0.013 (95% CI 0.002–0.025).</w:t>
@@ -3311,18 +3311,18 @@
           <wp:inline>
             <wp:extent cx="5486400" cy="3429000"/>
             <wp:effectExtent b="0" l="0" r="0" t="0"/>
-            <wp:docPr descr="" title="" id="27" name="Picture"/>
+            <wp:docPr descr="" title="" id="38" name="Picture"/>
             <a:graphic>
               <a:graphicData uri="http://schemas.openxmlformats.org/drawingml/2006/picture">
                 <pic:pic>
                   <pic:nvPicPr>
-                    <pic:cNvPr descr="../exports/results/Qwen-Qwen3-Embedding-8B/google_medgemma-27b-text-it/discrimination_forest_EMBEDDED_vs_FEATURE.png" id="28" name="Picture"/>
+                    <pic:cNvPr descr="../results/Qwen-Qwen3-Embedding-8B/google_medgemma-27b-text-it/discrimination_forest_EMBEDDED_vs_FEATURE.png" id="39" name="Picture"/>
                     <pic:cNvPicPr>
                       <a:picLocks noChangeArrowheads="1" noChangeAspect="1"/>
                     </pic:cNvPicPr>
                   </pic:nvPicPr>
                   <pic:blipFill>
-                    <a:blip r:embed="rId26"/>
+                    <a:blip r:embed="rId37"/>
                     <a:stretch>
                       <a:fillRect/>
                     </a:stretch>
@@ -3385,8 +3385,8 @@
         <w:t xml:space="preserve">AUPRC was 0.302 (95% CI 0.281–0.325) for embedded logistic regression and 0.298 (95% CI 0.276–0.322) for feature-vector XGBoost, compared with the test patients’ positive-rate reference of 0.175 (95% CI 0.167–0.183). Brier scores were 0.137 (95% CI 0.132–0.142) and 0.138 (95% CI 0.132–0.143), respectively. Calibration varied by model and method of assessment; the individual-level logistic calibration slope for embedded logistic regression was 0.97 (95% CI 0.88–1.06). Full calibration summaries, precision–recall curves, and descriptive operating points appear in Multimedia Appendix 1, sections S2–S3, S9, and S12.</w:t>
       </w:r>
     </w:p>
-    <w:bookmarkEnd w:id="29"/>
-    <w:bookmarkStart w:id="33" w:name="_63f7a4acd42581b8799fc792085d5dd77d614be"/>
+    <w:bookmarkEnd w:id="40"/>
+    <w:bookmarkStart w:id="44" w:name="X63f7a4acd42581b8799fc792085d5dd77d614be"/>
     <w:p>
       <w:pPr>
         <w:pStyle w:val="Heading2"/>
@@ -3870,7 +3870,7 @@
     </w:tbl>
     <w:p>
       <w:pPr>
-        <w:pStyle w:val="FirstParagraph"/>
+        <w:pStyle w:val="BodyText"/>
       </w:pPr>
       <w:r>
         <w:t xml:space="preserve">Logistic regression was the strongest embedded classifier for all 4 encoders, with ROC AUCs from 0.645 (95% CI 0.629–0.660) to 0.657 (95% CI 0.643–0.672). Psychiatric history and medication burden remained the largest contributors across encoders. Permuting psychiatric history reduced logistic-regression ROC AUC by 0.027 (95% CI 0.017–0.036) to 0.030 (95% CI 0.019–0.041), and permuting medication burden by 0.022 (95% CI 0.013–0.032) to 0.034 (95% CI 0.023–0.044) (Figure 3). Feature-vector coefficient rankings also emphasized psychiatric burden, including suicidality, severe depression coding, insomnia, and anxiety. Detailed importance, dimensionality, and encoder analyses are in Multimedia Appendix 1, sections S1, S4, and S12.</w:t>
@@ -3885,18 +3885,18 @@
           <wp:inline>
             <wp:extent cx="5486400" cy="2663334"/>
             <wp:effectExtent b="0" l="0" r="0" t="0"/>
-            <wp:docPr descr="" title="" id="31" name="Picture"/>
+            <wp:docPr descr="" title="" id="42" name="Picture"/>
             <a:graphic>
               <a:graphicData uri="http://schemas.openxmlformats.org/drawingml/2006/picture">
                 <pic:pic>
                   <pic:nvPicPr>
-                    <pic:cNvPr descr="../exports/results/cross_embedder_robustness_EMBEDDED.png" id="32" name="Picture"/>
+                    <pic:cNvPr descr="../results/cross_embedder_robustness_EMBEDDED.png" id="43" name="Picture"/>
                     <pic:cNvPicPr>
                       <a:picLocks noChangeArrowheads="1" noChangeAspect="1"/>
                     </pic:cNvPicPr>
                   </pic:nvPicPr>
                   <pic:blipFill>
-                    <a:blip r:embed="rId30"/>
+                    <a:blip r:embed="rId41"/>
                     <a:stretch>
                       <a:fillRect/>
                     </a:stretch>
@@ -3951,14 +3951,14 @@
         <w:t xml:space="preserve">Encoder robustness for embedded logistic regression. A: ROC AUC with bootstrap 95% CIs. B: change in ROC AUC after permutation of psychiatric history or medication burden, with paired bootstrap 95% CIs. Encoders are bge-small-en-v1.5, bge-en-icl, Qwen3-Embedding-4B, and Qwen3-Embedding-8B. Complete encoder estimates appear in Multimedia Appendix 1, Table S15.</w:t>
       </w:r>
     </w:p>
-    <w:bookmarkEnd w:id="33"/>
-    <w:bookmarkStart w:id="37" w:name="_8ca3efeaa8d9d9d1376f80bd09636098b9bcacd"/>
+    <w:bookmarkEnd w:id="44"/>
+    <w:bookmarkStart w:id="48" w:name="nearest-neighbor-retrieval"/>
     <w:p>
       <w:pPr>
         <w:pStyle w:val="Heading2"/>
       </w:pPr>
       <w:r>
-        <w:t xml:space="preserve">Retrieval and Subgroup Performance</w:t>
+        <w:t xml:space="preserve">Nearest-Neighbor Retrieval</w:t>
       </w:r>
     </w:p>
     <w:p>
@@ -3966,7 +3966,7 @@
         <w:pStyle w:val="FirstParagraph"/>
       </w:pPr>
       <w:r>
-        <w:t xml:space="preserve">Retrieval is reported as a curve over neighborhood size (Figure 4). At every k from 1 to 34,063, both nearest-neighbor metrics stayed below both leading classifiers, and random retrieval stayed at chance. Neighborhood size mattered more than the similarity metric. Discrimination rose with k up to a few hundred neighbors. From k = 261 onward, logistic-regression-weighted retrieval stayed inside the interval at its best k. Plain cosine retrieval peaked and then drifted down, to 0.605 (95% CI 0.589–0.620) at k = 16,988. Each arm’s maximum was read at its best k, chosen on the test patients, so these maxima are optimistic. Logistic-regression-weighted retrieval reached 0.625 (95% CI 0.610–0.641) at k = 295, plain cosine 0.618 (95% CI 0.602–0.634) at k = 757, and random retrieval 0.500 (2.5th–97.5th percentile across draws 0.484–0.515) at k = 32,720, a best k that is noise. The 2 nearest-neighbor metrics exceeded random retrieval by 0.125 (95% CI 0.103–0.147) and 0.118 (95% CI 0.096–0.140), respectively, and differed from each other by 0.007 (95% CI −0.001 to 0.014). The best retrieval result over every k and exponent was logistic-regression-weighted retrieval with α = 2 at k = 1,090, 0.625 (95% CI 0.610–0.640). It was still lower than feature-vector XGBoost by 0.024 (95% CI 0.012–0.036) and lower than embedded logistic regression by 0.032 (95% CI 0.022–0.043). Using all 34,063 training patients as neighbors, with no k chosen, gave 0.624 (95% CI 0.607–0.639) for logistic-regression-weighted retrieval and 0.608 (95% CI 0.592–0.624) for plain cosine. ROC curves and confusion matrices at each arm’s best k are in Multimedia Appendix 1, section S6.</w:t>
+        <w:t xml:space="preserve">Retrieval is reported as a curve over neighborhood size (Figure 4D for the primary encoder). At every k from 1 to 34,063, both nearest-neighbor metrics stayed below both leading classifiers, and random retrieval stayed at chance. Neighborhood size mattered more than the similarity metric. Discrimination rose with k up to a few hundred neighbors. From k = 261 onward, logistic-regression-weighted retrieval stayed inside the interval at its best k. Plain cosine retrieval peaked and then drifted down, to 0.605 (95% CI 0.589–0.620) at k = 16,988. Each arm’s maximum was read at its best k, chosen on the test patients, so these maxima are optimistic. Logistic-regression-weighted retrieval reached 0.625 (95% CI 0.610–0.641) at k = 295, plain cosine 0.618 (95% CI 0.602–0.634) at k = 757, and random retrieval 0.500 (2.5th–97.5th percentile across draws 0.484–0.515) at k = 32,720, a best k that is noise. The 2 nearest-neighbor metrics exceeded random retrieval by 0.125 (95% CI 0.103–0.147) and 0.118 (95% CI 0.096–0.140), respectively, and differed from each other by 0.007 (95% CI −0.001 to 0.014). The best retrieval result over every k and exponent was logistic-regression-weighted retrieval with α = 2 at k = 1,090, 0.625 (95% CI 0.610–0.640). It was still lower than feature-vector XGBoost by 0.024 (95% CI 0.012–0.036) and lower than embedded logistic regression by 0.032 (95% CI 0.022–0.043). Using all 34,063 training patients as neighbors, with no k chosen, gave 0.624 (95% CI 0.607–0.639) for logistic-regression-weighted retrieval and 0.608 (95% CI 0.592–0.624) for plain cosine. These stay above chance because each neighbor’s vote is weighted by its similarity, so the same 34,063 neighbors are weighed differently for each patient. With equal weights, every patient would get the same score and ROC AUC would be exactly 0.5, which is what random retrieval gave at k = 34,063. ROC curves and confusion matrices at each arm’s best k are in Multimedia Appendix 1, section S6.</w:t>
       </w:r>
     </w:p>
     <w:p>
@@ -3976,20 +3976,20 @@
       <w:r>
         <w:drawing>
           <wp:inline>
-            <wp:extent cx="5486400" cy="4879361"/>
+            <wp:extent cx="5486400" cy="5035534"/>
             <wp:effectExtent b="0" l="0" r="0" t="0"/>
-            <wp:docPr descr="" title="" id="35" name="Picture"/>
+            <wp:docPr descr="" title="" id="46" name="Picture"/>
             <a:graphic>
               <a:graphicData uri="http://schemas.openxmlformats.org/drawingml/2006/picture">
                 <pic:pic>
                   <pic:nvPicPr>
-                    <pic:cNvPr descr="../exports/results/Qwen-Qwen3-Embedding-8B/google_medgemma-27b-text-it/neighbor_count_sweep/neighbor_count_sweep_manuscript.png" id="36" name="Picture"/>
+                    <pic:cNvPr descr="../results/cross_embedder_retrieval/neighbor_count_sweep_panels.png" id="47" name="Picture"/>
                     <pic:cNvPicPr>
                       <a:picLocks noChangeArrowheads="1" noChangeAspect="1"/>
                     </pic:cNvPicPr>
                   </pic:nvPicPr>
                   <pic:blipFill>
-                    <a:blip r:embed="rId34"/>
+                    <a:blip r:embed="rId45"/>
                     <a:stretch>
                       <a:fillRect/>
                     </a:stretch>
@@ -3997,7 +3997,7 @@
                   <pic:spPr bwMode="auto">
                     <a:xfrm>
                       <a:off x="0" y="0"/>
-                      <a:ext cx="5486400" cy="4879361"/>
+                      <a:ext cx="5486400" cy="5035534"/>
                     </a:xfrm>
                     <a:prstGeom prst="rect">
                       <a:avLst/>
@@ -4041,19 +4041,11 @@
           <w:i/>
           <w:iCs/>
         </w:rPr>
-        <w:t xml:space="preserve">Retrieval discrimination by neighborhood size. ROC AUC in 8,516 test patients at every k from 1 to 34,063 for logistic-regression-weighted and plain cosine retrieval, with bootstrap 95% bands, and for random retrieval with uniform weights, as the mean across 1,000 draws within the 2.5th–97.5th percentile of the draws. Points mark each arm’s best k, chosen on the test patients, so the values there are optimistic; the random arm’s best k is noise. Horizontal lines mark the 2 leading trained classifiers. Curves use α = 1; the maxima under α = 1, 2, and 5 agreed within 0.002. Figure 5 draws the same plot for the other 3 encoders.</w:t>
-      </w:r>
-    </w:p>
-    <w:p>
-      <w:pPr>
-        <w:pStyle w:val="BodyText"/>
-      </w:pPr>
-      <w:r>
-        <w:t xml:space="preserve">Subgroup analyses scored each retrieval arm at its best k. Of 240 subgroup contrasts, 23 survived multiplicity adjustment; 19 involved depression recurrence. Discrimination was higher with recurrent coding in all 10 models contrasted and lower with single-episode coding in 9. Performance was lower among never-married patients for 2 embedded classifiers and logistic-regression-weighted retrieval, and among patients aged 18–29 for feature-vector XGBoost. Sex contrasts did not show clear differences. White-minus-non-White ROC AUC differences were consistently positive, from +0.005 (95% CI −0.031 to +0.042) to +0.046 (95% CI +0.006 to +0.087), but none survived adjustment. For feature-vector logistic regression, individual-level calibration slopes were 0.98 (95% CI 0.85–1.11) in White patients and 0.79 (95% CI 0.56–1.02) in patients with other recorded racial categories. These findings do not establish equitable performance (Multimedia Appendix 1, section S9).</w:t>
-      </w:r>
-    </w:p>
-    <w:bookmarkEnd w:id="37"/>
-    <w:bookmarkStart w:id="44" w:name="_396e520dd6495a396736514718baa51d7644dd0"/>
+        <w:t xml:space="preserve">Retrieval discrimination by neighborhood size for the 4 encoders: (A) bge-small-en-v1.5, (B) bge-en-icl, (C) Qwen3-Embedding-4B, and (D) Qwen3-Embedding-8B, the primary encoder. Each panel title gives the encoder’s number of embedding dimensions. Each panel draws ROC AUC in 8,516 test patients at every k from 1 to 34,063. Lines are the retrieval arms: logistic-regression-weighted and plain cosine retrieval with bootstrap 95% bands, and random retrieval with uniform weights, as the mean across 1,000 draws within the 2.5th–97.5th percentile of the draws. Each encoder’s weights come from its own embedded logistic regression. Random retrieval does not use the embedding, so it is the same in every panel. Diamonds mark each arm’s best k, chosen on the test patients, so the values there are optimistic; the random arm’s best k is noise. Each panel’s best-k values are listed beneath it. Horizontal lines mark that encoder’s embedded logistic regression and feature-vector XGBoost, which is the same in every panel. Curves use α = 1; for the primary encoder, the maxima under α = 1, 2, and 5 agreed within 0.002.</w:t>
+      </w:r>
+    </w:p>
+    <w:bookmarkEnd w:id="48"/>
+    <w:bookmarkStart w:id="49" w:name="X396e520dd6495a396736514718baa51d7644dd0"/>
     <w:p>
       <w:pPr>
         <w:pStyle w:val="Heading2"/>
@@ -4067,7 +4059,7 @@
         <w:pStyle w:val="FirstParagraph"/>
       </w:pPr>
       <w:r>
-        <w:t xml:space="preserve">We repeated the neighborhood-size sweep for the other 3 encoders under the same rules, for both nearest-neighbor metrics and random retrieval. Each encoder’s logistic-regression-weighted similarity used the coefficients of that encoder’s own embedded logistic regression. For every encoder, both nearest-neighbor curves stayed below that encoder’s embedded logistic regression at every k (Figure 5). Each metric’s maximum was read at its own best k under α = 1, chosen on the test patients, so these maxima are optimistic.</w:t>
+        <w:t xml:space="preserve">We repeated the neighborhood-size sweep for the other 3 encoders under the same rules, for both nearest-neighbor metrics and random retrieval. Each encoder’s logistic-regression-weighted similarity used the coefficients of that encoder’s own embedded logistic regression. For every encoder, both nearest-neighbor curves stayed below that encoder’s embedded logistic regression at every k (Figure 4A–D). Each metric’s maximum was read at its own best k under α = 1, chosen on the test patients, so these maxima are optimistic.</w:t>
       </w:r>
     </w:p>
     <w:p>
@@ -4083,7 +4075,57 @@
         <w:pStyle w:val="BodyText"/>
       </w:pPr>
       <w:r>
-        <w:t xml:space="preserve">Plain cosine retrieval peaked at k = 1,243, 413, 493, and 757 for the same 4 encoders. It reached 0.602 (95% CI 0.586–0.618), 0.620 (95% CI 0.605–0.637), 0.621 (95% CI 0.605–0.637), and 0.618 (95% CI 0.602–0.634), lower than the weighted metric for every encoder. Only the primary encoder’s difference was tested, 0.007 (95% CI −0.001 to 0.014). Every best k for either metric lay between 295 and 1,519. Using all 34,063 training patients as neighbors, weighted retrieval gave 0.617 (95% CI 0.600–0.633) to 0.629 (95% CI 0.614–0.645) for the 3 larger encoders. For bge-small-en-v1.5 it fell to 0.580 (95% CI 0.565–0.595), the steepest decline of any encoder’s weighted curve at large k. Near the whole pool (k above about 30,500), every patient’s neighborhood is nearly the same set, so the risk estimates differ by about 0.0004 (risk SD 4.00 × 10⁻⁴ at bge-small-en-v1.5’s lowest point, k = 31,447), and plain cosine ROC AUC becomes unstable, ranging from 0.511 to 0.582 for bge-small-en-v1.5 and from 0.579 to 0.606 for bge-en-icl, with no change to any conclusion. ROC curves and confusion matrices for each encoder’s nearest-neighbor metrics at their best k are in Multimedia Appendix 1, section S6.</w:t>
+        <w:t xml:space="preserve">Plain cosine retrieval peaked at k = 1,243, 413, 493, and 757 for the same 4 encoders. It reached 0.602 (95% CI 0.586–0.618), 0.620 (95% CI 0.605–0.637), 0.621 (95% CI 0.605–0.637), and 0.618 (95% CI 0.602–0.634), lower than the weighted metric for every encoder. Only the primary encoder’s difference was tested, 0.007 (95% CI −0.001 to 0.014), and its interval includes zero. Agreement in direction across 4 encoders does not show that weighting helps, because each maximum was read at its own best k. Every best k for either metric lay between 295 and 1,519. Using all 34,063 training patients as neighbors, weighted retrieval gave 0.617 (95% CI 0.600–0.633) to 0.629 (95% CI 0.614–0.645) for the 3 larger encoders. For bge-small-en-v1.5 it fell to 0.580 (95% CI 0.565–0.595), the steepest decline of any encoder’s weighted curve at large k. Near the whole pool (k above about 30,500), every patient’s neighborhood is nearly the same set, so the risk estimates differ by about 0.0004 (risk SD 4.00 × 10⁻⁴ at bge-small-en-v1.5’s lowest point, k = 31,447), and plain cosine ROC AUC becomes unstable, ranging from 0.511 to 0.582 for bge-small-en-v1.5 and from 0.579 to 0.606 for bge-en-icl, with no change to any conclusion. ROC curves and confusion matrices for each encoder’s nearest-neighbor metrics at their best k are in Multimedia Appendix 1, section S6.</w:t>
+      </w:r>
+    </w:p>
+    <w:p>
+      <w:pPr>
+        <w:pStyle w:val="BodyText"/>
+      </w:pPr>
+      <w:r>
+        <w:t xml:space="preserve">Best k followed no clear pattern. Two encoders with the same 4,096 dimensions moved in opposite directions when weighting was added: best k rose from 413 to 1,519 for bge-en-icl and fell from 757 to 295 for Qwen3-Embedding-8B. The curves were flat near their peaks, which accounts for much of this. For every encoder and metric, ROC AUC stayed within 0.005 of its maximum over a wide range of k. That range began between k = 164 and 549 and ended between k = 1,613 and the whole pool of 34,063. These ranges describe the observed curves and carry no sampling interval. On a curve this flat, a small change in the patients can move the best k a long way while barely changing ROC AUC. The range of k that performs near the peak is more informative than the single best k.</w:t>
+      </w:r>
+    </w:p>
+    <w:p>
+      <w:pPr>
+        <w:pStyle w:val="BodyText"/>
+      </w:pPr>
+      <w:r>
+        <w:t xml:space="preserve">Best k also did not follow how many embedding dimensions each logistic regression relied on, whether counted directly or as a share of the encoder’s dimensions (Multimedia Appendix 1, section S6, Figures S10–S11).</w:t>
+      </w:r>
+    </w:p>
+    <w:bookmarkEnd w:id="49"/>
+    <w:bookmarkStart w:id="53" w:name="subgroup-performance"/>
+    <w:p>
+      <w:pPr>
+        <w:pStyle w:val="Heading2"/>
+      </w:pPr>
+      <w:r>
+        <w:t xml:space="preserve">Subgroup Performance</w:t>
+      </w:r>
+    </w:p>
+    <w:p>
+      <w:pPr>
+        <w:pStyle w:val="FirstParagraph"/>
+      </w:pPr>
+      <w:r>
+        <w:t xml:space="preserve">Subgroup analyses covered all 8 classifiers and both nearest-neighbor arms, for the primary encoder; each retrieval arm was scored at its best k. Each contrast compared one group’s ROC AUC with that of all other test patients, for the same model. The groups were of 2 kinds. Sociodemographic groups (sex, race, age, marital status, smoking, and religion) ask whether the models work equally well for different people. Clinical groups (MDD recurrence and severity) ask whether they work equally well across ways the illness was recorded.</w:t>
+      </w:r>
+    </w:p>
+    <w:p>
+      <w:pPr>
+        <w:pStyle w:val="BodyText"/>
+      </w:pPr>
+      <w:r>
+        <w:t xml:space="preserve">Of 240 contrasts, 23 survived Benjamini–Hochberg adjustment for multiple comparisons, and both kinds of group contributed (Figure 5). Nineteen were clinical, all involving recurrence. Every model discriminated better in patients coded with recurrent depression, by +0.053 (95% CI +0.022 to +0.085) to +0.072 (95% CI +0.041 to +0.104). Nine of 10 discriminated worse in patients coded with a single episode, by −0.047 (95% CI −0.079 to −0.014) to −0.071 (95% CI −0.105 to −0.039). These describe how the illness was recorded, not who the patients are, so they are not fairness findings.</w:t>
+      </w:r>
+    </w:p>
+    <w:p>
+      <w:pPr>
+        <w:pStyle w:val="BodyText"/>
+      </w:pPr>
+      <w:r>
+        <w:t xml:space="preserve">The other 4 were sociodemographic. Discrimination was lower among never-married patients for 2 embedded classifiers and logistic-regression-weighted retrieval, by −0.047 (95% CI −0.080 to −0.012) to −0.054 (95% CI −0.090 to −0.019). It was lower among patients aged 18–29 for feature-vector XGBoost, by −0.068 (95% CI −0.117 to −0.022). Sex contrasts did not show clear differences. White-minus-non-White ROC AUC differences were consistently positive, from +0.005 (95% CI −0.031 to +0.042) to +0.046 (95% CI +0.006 to +0.087), but none survived adjustment. These findings do not establish equitable performance. Calibration within each subgroup is in Multimedia Appendix 1, section S9.</w:t>
       </w:r>
     </w:p>
     <w:p>
@@ -4093,20 +4135,20 @@
       <w:r>
         <w:drawing>
           <wp:inline>
-            <wp:extent cx="5486400" cy="5570854"/>
+            <wp:extent cx="5029200" cy="5297567"/>
             <wp:effectExtent b="0" l="0" r="0" t="0"/>
-            <wp:docPr descr="" title="" id="39" name="Picture"/>
+            <wp:docPr descr="" title="" id="51" name="Picture"/>
             <a:graphic>
               <a:graphicData uri="http://schemas.openxmlformats.org/drawingml/2006/picture">
                 <pic:pic>
                   <pic:nvPicPr>
-                    <pic:cNvPr descr="../exports/results/cross_embedder_retrieval/neighbor_count_sweep_panels.png" id="40" name="Picture"/>
+                    <pic:cNvPr descr="../results/review/subgroups/subgroup_surviving_contrasts.png" id="52" name="Picture"/>
                     <pic:cNvPicPr>
                       <a:picLocks noChangeArrowheads="1" noChangeAspect="1"/>
                     </pic:cNvPicPr>
                   </pic:nvPicPr>
                   <pic:blipFill>
-                    <a:blip r:embed="rId38"/>
+                    <a:blip r:embed="rId50"/>
                     <a:stretch>
                       <a:fillRect/>
                     </a:stretch>
@@ -4114,7 +4156,7 @@
                   <pic:spPr bwMode="auto">
                     <a:xfrm>
                       <a:off x="0" y="0"/>
-                      <a:ext cx="5486400" cy="5570854"/>
+                      <a:ext cx="5029200" cy="5297567"/>
                     </a:xfrm>
                     <a:prstGeom prst="rect">
                       <a:avLst/>
@@ -4158,95 +4200,12 @@
           <w:i/>
           <w:iCs/>
         </w:rPr>
-        <w:t xml:space="preserve">Retrieval discrimination by neighborhood size for the other 3 encoders: (A) bge-small-en-v1.5, (B) bge-en-icl, and (C) Qwen3-Embedding-4B. Figure 4 is the same plot for Qwen3-Embedding-8B. Each panel draws ROC AUC in 8,516 test patients at every k from 1 to 34,063 for logistic-regression-weighted and plain cosine retrieval, with bootstrap 95% bands, and for random retrieval with uniform weights, as the mean across 1,000 draws within the 2.5th–97.5th percentile of the draws. Each encoder’s weights come from its own embedded logistic regression. Points mark each arm’s best k, chosen on the test patients, so the values there are optimistic. Horizontal lines mark that encoder’s embedded logistic regression and feature-vector XGBoost, which is the same in every panel. Curves use α = 1.</w:t>
-      </w:r>
-    </w:p>
-    <w:p>
-      <w:pPr>
-        <w:pStyle w:val="BodyText"/>
-      </w:pPr>
-      <w:r>
-        <w:t xml:space="preserve">The number of embedding dimensions each logistic regression relied on was similar for 3 of the 4 encoders. The fewest dimensions holding 90% of the absolute coefficient mass were 253 for bge-small-en-v1.5, 271 for bge-en-icl, 1,626 for Qwen3-Embedding-4B, and 236 for Qwen3-Embedding-8B. These counts describe each fitted model and carry no sampling interval. Best k did not follow them. Qwen3-Embedding-4B used the most dimensions, yet its best k, 684 and 493 for the 2 metrics, lay inside the range of the other encoders (Figure 6). With 4 encoders, this comparison describes a relation and does not test one.</w:t>
-      </w:r>
-    </w:p>
-    <w:p>
-      <w:pPr>
-        <w:pStyle w:val="BodyText"/>
-      </w:pPr>
-      <w:r>
-        <w:drawing>
-          <wp:inline>
-            <wp:extent cx="5486400" cy="4601496"/>
-            <wp:effectExtent b="0" l="0" r="0" t="0"/>
-            <wp:docPr descr="" title="" id="42" name="Picture"/>
-            <a:graphic>
-              <a:graphicData uri="http://schemas.openxmlformats.org/drawingml/2006/picture">
-                <pic:pic>
-                  <pic:nvPicPr>
-                    <pic:cNvPr descr="../exports/results/cross_embedder_retrieval/lr_dimensions_vs_best_k.png" id="43" name="Picture"/>
-                    <pic:cNvPicPr>
-                      <a:picLocks noChangeArrowheads="1" noChangeAspect="1"/>
-                    </pic:cNvPicPr>
-                  </pic:nvPicPr>
-                  <pic:blipFill>
-                    <a:blip r:embed="rId41"/>
-                    <a:stretch>
-                      <a:fillRect/>
-                    </a:stretch>
-                  </pic:blipFill>
-                  <pic:spPr bwMode="auto">
-                    <a:xfrm>
-                      <a:off x="0" y="0"/>
-                      <a:ext cx="5486400" cy="4601496"/>
-                    </a:xfrm>
-                    <a:prstGeom prst="rect">
-                      <a:avLst/>
-                    </a:prstGeom>
-                    <a:noFill/>
-                    <a:ln w="9525">
-                      <a:noFill/>
-                      <a:headEnd/>
-                      <a:tailEnd/>
-                    </a:ln>
-                  </pic:spPr>
-                </pic:pic>
-              </a:graphicData>
-            </a:graphic>
-          </wp:inline>
-        </w:drawing>
-      </w:r>
-    </w:p>
-    <w:p>
-      <w:pPr>
-        <w:pStyle w:val="BodyText"/>
-      </w:pPr>
-      <w:r>
-        <w:rPr>
-          <w:b/>
-          <w:bCs/>
-          <w:i/>
-          <w:iCs/>
-        </w:rPr>
-        <w:t xml:space="preserve">Figure 6.</w:t>
-      </w:r>
-      <w:r>
-        <w:rPr>
-          <w:i/>
-          <w:iCs/>
-        </w:rPr>
-        <w:t xml:space="preserve"> </w:t>
-      </w:r>
-      <w:r>
-        <w:rPr>
-          <w:i/>
-          <w:iCs/>
-        </w:rPr>
-        <w:t xml:space="preserve">Logistic-regression dimensions against best k for the 4 encoders. The horizontal axis is the fewest embedding dimensions holding 90% of the absolute coefficient mass of each encoder’s embedded logistic regression. The vertical axis is the best k of logistic-regression-weighted (filled markers) and plain cosine retrieval (open markers), chosen on the test patients and therefore optimistic. Both axes are logarithmic. In-plot labels abbreviate bge-small-en-v1.5, Qwen3-Embedding-4B, and Qwen3-Embedding-8B.</w:t>
-      </w:r>
-    </w:p>
-    <w:bookmarkEnd w:id="44"/>
-    <w:bookmarkEnd w:id="45"/>
-    <w:bookmarkStart w:id="51" w:name="_discussion"/>
+        <w:t xml:space="preserve">Subgroup contrasts that survived Benjamini–Hochberg adjustment across 240 contrasts, for the primary encoder. Each row is one model’s ROC AUC in the named group minus its ROC AUC in all other test patients, with a bootstrap 95% CI. Every model whose contrast survived is shown; the other 217 contrasts did not survive. Multimedia Appendix 1, section S9 gives discrimination and calibration within each subgroup for one model per approach and summarizes the sex and race contrasts. Clinical groups describe how depression was recorded; sociodemographic groups describe the patients. Group sizes and outcome counts are for the test patients. Retrieval arms are scored at their best k, chosen on the test patients. LR: logistic regression; MDD: major depressive disorder.</w:t>
+      </w:r>
+    </w:p>
+    <w:bookmarkEnd w:id="53"/>
+    <w:bookmarkEnd w:id="54"/>
+    <w:bookmarkStart w:id="61" w:name="discussion"/>
     <w:p>
       <w:pPr>
         <w:pStyle w:val="Heading1"/>
@@ -4255,7 +4214,7 @@
         <w:t xml:space="preserve">Discussion</w:t>
       </w:r>
     </w:p>
-    <w:bookmarkStart w:id="46" w:name="_4ff16389c13055d3b73fad181cc5927e5a98872"/>
+    <w:bookmarkStart w:id="55" w:name="principal-findings"/>
     <w:p>
       <w:pPr>
         <w:pStyle w:val="Heading2"/>
@@ -4288,8 +4247,8 @@
         <w:t xml:space="preserve">The predictive signal was concentrated in familiar aspects of clinical history. Psychiatric comorbidity, medication burden, and prior treatment contributed most to embedded discrimination, while feature-vector models highlighted related markers of illness complexity. Nearest-neighbor analyses showed that embedding proximity was associated with the outcome: randomly chosen neighbors gave chance discrimination at every neighborhood size. Retrieval still fell short of the trained classifiers at every neighborhood size, and the number of neighbors mattered more than how similarity was weighted. Taken together, these findings suggest that embeddings reorganized useful information already recorded in the EHR; they do not demonstrate a new measure of treatment resistance.</w:t>
       </w:r>
     </w:p>
-    <w:bookmarkEnd w:id="46"/>
-    <w:bookmarkStart w:id="47" w:name="_3636ce9be5da45ab88a1fa0b95c3374871bf13a"/>
+    <w:bookmarkEnd w:id="55"/>
+    <w:bookmarkStart w:id="56" w:name="comparison-with-prior-work"/>
     <w:p>
       <w:pPr>
         <w:pStyle w:val="Heading2"/>
@@ -4314,8 +4273,8 @@
         <w:t xml:space="preserve">The present contribution is the direct comparison of practical representation pipelines under a shared cohort, prediction time, and test split. It does not set a performance ceiling for EHR prediction. Adding independently informative measurements may improve prediction, as may better outcome ascertainment. Re-encoding existing records should therefore be judged by incremental performance, reproducibility, and implementation burden rather than model size alone.</w:t>
       </w:r>
     </w:p>
-    <w:bookmarkEnd w:id="47"/>
-    <w:bookmarkStart w:id="48" w:name="_d5f796a8c7b3734ab52735d14bab7ca275f0d55"/>
+    <w:bookmarkEnd w:id="56"/>
+    <w:bookmarkStart w:id="57" w:name="clinical-interpretation-and-limitations"/>
     <w:p>
       <w:pPr>
         <w:pStyle w:val="Heading2"/>
@@ -4348,13 +4307,63 @@
         <w:t xml:space="preserve">The minimal change after race/ethnicity or social-determinant permutation is useful but does not establish fairness. These fields may be incompletely recorded, related information may remain in other predictors, and the outcome depends on access to treatment [28,29]. The subgroup analyses were limited by small event counts and broad racial aggregation, with unresolved differences in discrimination and calibration. Similarly, concept permutation measures sensitivity to altered inputs rather than a causal contribution; correlated fields and implausible combinations after permutation limit attribution.</w:t>
       </w:r>
     </w:p>
-    <w:bookmarkEnd w:id="48"/>
-    <w:bookmarkStart w:id="49" w:name="_2176107ceb905df0767f129fe8aec029a2e4a17"/>
+    <w:bookmarkEnd w:id="57"/>
+    <w:bookmarkStart w:id="58" w:name="interpreting-nearest-neighbor-retrieval"/>
     <w:p>
       <w:pPr>
         <w:pStyle w:val="Heading2"/>
       </w:pPr>
       <w:r>
+        <w:t xml:space="preserve">Interpreting Nearest-Neighbor Retrieval</w:t>
+      </w:r>
+    </w:p>
+    <w:p>
+      <w:pPr>
+        <w:pStyle w:val="FirstParagraph"/>
+      </w:pPr>
+      <w:r>
+        <w:t xml:space="preserve">Retrieval shows that the embeddings place patients with similar outcomes near each other. Randomly chosen neighbors gave chance discrimination, and nearest neighbors rose well above it for every encoder. A trained logistic regression on the same embedding still did better at every neighborhood size.</w:t>
+      </w:r>
+    </w:p>
+    <w:p>
+      <w:pPr>
+        <w:pStyle w:val="BodyText"/>
+      </w:pPr>
+      <w:r>
+        <w:t xml:space="preserve">The number of neighbors works like a smoothing setting. With 1 neighbor, a patient’s risk is another patient’s 0 or 1 outcome, which is mostly noise. Averaging more neighbors steadies the estimate. That is why both nearest-neighbor curves rose from near chance at k = 1 for every encoder. Past a few hundred neighbors, the added patients are less alike in outcome risk, and plain cosine retrieval drifted down. The best k is therefore not a count of patient types or risk factors. It need not match the number of embedding dimensions a model relies on, and in these 4 encoders it did not.</w:t>
+      </w:r>
+    </w:p>
+    <w:p>
+      <w:pPr>
+        <w:pStyle w:val="BodyText"/>
+      </w:pPr>
+      <w:r>
+        <w:t xml:space="preserve">Weighting by logistic-regression coefficients changes which patients count as close. Plain cosine similarity reflects everything in the narrative, including content unrelated to the outcome. The weighted metric emphasizes the dimensions the classifier found predictive. Learning a distance from the outcome is an established way to improve nearest-neighbor prediction [30]. It also means the weighted metric borrows from a supervised model, so its gains are not a property of the pretrained encoder alone.</w:t>
+      </w:r>
+    </w:p>
+    <w:p>
+      <w:pPr>
+        <w:pStyle w:val="BodyText"/>
+      </w:pPr>
+      <w:r>
+        <w:t xml:space="preserve">Weighted retrieval still trails the logistic regression, and one reason is built into the weights. They keep the size of each coefficient but drop its sign. The classifier instead adds signed contributions into one score, so 2 patients can reach the same predicted risk through different features. Those 2 patients need not be close under the weighted similarity.</w:t>
+      </w:r>
+    </w:p>
+    <w:p>
+      <w:pPr>
+        <w:pStyle w:val="BodyText"/>
+      </w:pPr>
+      <w:r>
+        <w:t xml:space="preserve">Two cautions limit these interpretations. First, best k and the maxima were chosen on the test patients, and choosing a setting in the same patients it is scored on overstates performance [31]. A fair test would fit the weights and choose k inside the training data, for example by nested cross-validation, then score held-out patients once. Second, similar records are not similar biology. Neighbors share recorded psychiatric history, medication burden, prior treatment, and patterns of care. Retrieval does not identify TRD subtypes, and it cannot separate failed treatment from switching for tolerability, access, or prescribing habits. Likewise, the lower results for bge-small-en-v1.5 do not show that fewer dimensions caused them, because the encoders also differ in architecture and training.</w:t>
+      </w:r>
+    </w:p>
+    <w:bookmarkEnd w:id="58"/>
+    <w:bookmarkStart w:id="59" w:name="implications-and-next-steps"/>
+    <w:p>
+      <w:pPr>
+        <w:pStyle w:val="Heading2"/>
+      </w:pPr>
+      <w:r>
         <w:t xml:space="preserve">Implications and Next Steps</w:t>
       </w:r>
     </w:p>
@@ -4366,8 +4375,8 @@
         <w:t xml:space="preserve">The current findings are useful, but the results do not support clinical deployment. The next steps are to validate the switching phenotype against treatment histories and symptom change, then evaluate frozen pipelines in temporal and external cohorts. Evaluation should compare embeddings with compact psychiatric-history, medication, and utilization baselines and report precision–recall performance, individual-level calibration, subgroup errors, and decision-analytic net benefit at prespecified thresholds. However, for an embedding pipeline to justify its added complexity, it should improve prediction, transportability, or clinical workflow beyond a simpler model. It is also possible that a more clinically informative prediction target may be as impactful for future investigations as a more elaborate representation of the case embedding.</w:t>
       </w:r>
     </w:p>
-    <w:bookmarkEnd w:id="49"/>
-    <w:bookmarkStart w:id="50" w:name="_conclusions"/>
+    <w:bookmarkEnd w:id="59"/>
+    <w:bookmarkStart w:id="60" w:name="conclusions"/>
     <w:p>
       <w:pPr>
         <w:pStyle w:val="Heading2"/>
@@ -4384,9 +4393,9 @@
         <w:t xml:space="preserve">At the index antidepressant prescription, structured feature vectors and narrative embeddings provided modest discrimination for a subsequent treatment-switching proxy for TRD, without demonstrated superiority of the strongest embedded model. Performance depended on the classifier. Progress toward clinical use requires better validation of the outcome and evidence that prediction improves decisions across patients and health systems.</w:t>
       </w:r>
     </w:p>
-    <w:bookmarkEnd w:id="50"/>
-    <w:bookmarkEnd w:id="51"/>
-    <w:bookmarkStart w:id="52" w:name="_acknowledgments"/>
+    <w:bookmarkEnd w:id="60"/>
+    <w:bookmarkEnd w:id="61"/>
+    <w:bookmarkStart w:id="62" w:name="acknowledgments"/>
     <w:p>
       <w:pPr>
         <w:pStyle w:val="Heading1"/>
@@ -4400,11 +4409,11 @@
         <w:pStyle w:val="FirstParagraph"/>
       </w:pPr>
       <w:r>
-        <w:t xml:space="preserve">ChatGPT (OpenAI) assisted with language editing and organization of the manuscript and supplement. The authors are responsible for the final content.</w:t>
-      </w:r>
-    </w:p>
-    <w:bookmarkEnd w:id="52"/>
-    <w:bookmarkStart w:id="53" w:name="_funding"/>
+        <w:t xml:space="preserve">ChatGPT (OpenAI) and Claude (Anthropic) assisted with language editing and organization of the manuscript and Multimedia Appendix 1. Claude also assisted with software development: it guided the first author through implementing the analysis and wrote parts of the code, including figure generation and data-handling routines. The authors reviewed and verified all code and analyses and are responsible for the final content.</w:t>
+      </w:r>
+    </w:p>
+    <w:bookmarkEnd w:id="62"/>
+    <w:bookmarkStart w:id="63" w:name="funding"/>
     <w:p>
       <w:pPr>
         <w:pStyle w:val="Heading1"/>
@@ -4421,8 +4430,8 @@
         <w:t xml:space="preserve">This work was funded by the William K. Warren Foundation. No other funding agency in the public, commercial, or not-for-profit sectors supported this research. M. Ferguson was supported by a graduate assistantship from the Laureate Institute for Brain Research while enrolled as a graduate student at The University of Tulsa. The funder had no role in the design of the study, the analysis or interpretation of the data, the writing of the manuscript, or the decision to submit it for publication.</w:t>
       </w:r>
     </w:p>
-    <w:bookmarkEnd w:id="53"/>
-    <w:bookmarkStart w:id="54" w:name="_ce73433e89afc27902f14cba7583f04156a1bb2"/>
+    <w:bookmarkEnd w:id="63"/>
+    <w:bookmarkStart w:id="64" w:name="conflicts-of-interest"/>
     <w:p>
       <w:pPr>
         <w:pStyle w:val="Heading1"/>
@@ -4439,8 +4448,8 @@
         <w:t xml:space="preserve">None declared.</w:t>
       </w:r>
     </w:p>
-    <w:bookmarkEnd w:id="54"/>
-    <w:bookmarkStart w:id="55" w:name="_ea5c66868f283220c19382d0fdd5a852ec570ca"/>
+    <w:bookmarkEnd w:id="64"/>
+    <w:bookmarkStart w:id="65" w:name="data-availability"/>
     <w:p>
       <w:pPr>
         <w:pStyle w:val="Heading1"/>
@@ -4457,8 +4466,8 @@
         <w:t xml:space="preserve">The EHR data cannot be shared publicly. Analysis code is available at https://github.com/Pirate-Hunter-Zoro/Atlas/tree/main/projects/TRD-EHR. Fitted model objects are not distributed because they are derived from nonshareable patient data.</w:t>
       </w:r>
     </w:p>
-    <w:bookmarkEnd w:id="55"/>
-    <w:bookmarkStart w:id="56" w:name="_b8356044e1855f49faa1ecb5e0ecc373fd3b25d"/>
+    <w:bookmarkEnd w:id="65"/>
+    <w:bookmarkStart w:id="66" w:name="authors-contributions"/>
     <w:p>
       <w:pPr>
         <w:pStyle w:val="Heading1"/>
@@ -4475,8 +4484,8 @@
         <w:t xml:space="preserve">MF designed and implemented the analysis pipeline, performed all modeling and statistical analysis, produced all figures and tables, including those in Multimedia Appendix 1, and wrote the Methods and Results. MP directed the project, supervised its scientific design and interpretation, and wrote the rest of the manuscript. KLF prepared the upstream clinical data, including the treatment-resistant depression labels and the antidepressant index dates that define the cohort and the outcome. RK, SS, and DP provided methodological feedback and guidance on the analysis and its interpretation throughout. All authors reviewed and approved the final manuscript.</w:t>
       </w:r>
     </w:p>
-    <w:bookmarkEnd w:id="56"/>
-    <w:bookmarkStart w:id="57" w:name="_84a99ffdccc35137f46316f3ade1c2b3666e00f"/>
+    <w:bookmarkEnd w:id="66"/>
+    <w:bookmarkStart w:id="67" w:name="protocol-and-registration"/>
     <w:p>
       <w:pPr>
         <w:pStyle w:val="Heading1"/>
@@ -4493,8 +4502,8 @@
         <w:t xml:space="preserve">No study protocol was prepared, and the study was not registered. The completed TRIPOD+AI checklist is provided as a separate submission document [19].</w:t>
       </w:r>
     </w:p>
-    <w:bookmarkEnd w:id="57"/>
-    <w:bookmarkStart w:id="58" w:name="_abbreviations"/>
+    <w:bookmarkEnd w:id="67"/>
+    <w:bookmarkStart w:id="68" w:name="abbreviations"/>
     <w:p>
       <w:pPr>
         <w:pStyle w:val="Heading1"/>
@@ -4551,8 +4560,8 @@
         <w:t xml:space="preserve">TRIPOD+AI: Transparent Reporting of a Multivariable Prediction Model for Individual Prognosis or Diagnosis plus Artificial Intelligence</w:t>
       </w:r>
     </w:p>
-    <w:bookmarkEnd w:id="58"/>
-    <w:bookmarkStart w:id="59" w:name="_0e5fd1e419bdcc070144e07b692f54cc99ea860"/>
+    <w:bookmarkEnd w:id="68"/>
+    <w:bookmarkStart w:id="69" w:name="multimedia-appendix-1"/>
     <w:p>
       <w:pPr>
         <w:pStyle w:val="Heading1"/>
@@ -4569,8 +4578,8 @@
         <w:t xml:space="preserve">Supplementary methods, predictor inventory, supporting analyses, and extended results for the comparison of structured feature vectors and narrative embeddings.</w:t>
       </w:r>
     </w:p>
-    <w:bookmarkEnd w:id="59"/>
-    <w:bookmarkStart w:id="60" w:name="_references"/>
+    <w:bookmarkEnd w:id="69"/>
+    <w:bookmarkStart w:id="70" w:name="references"/>
     <w:p>
       <w:pPr>
         <w:pStyle w:val="Heading1"/>
@@ -4600,7 +4609,7 @@
         <w:pStyle w:val="BodyText"/>
       </w:pPr>
       <w:r>
-        <w:t xml:space="preserve">3. Al-Harbi KS. Treatment-resistant depression: therapeutic trends, challenges, and future directions. Patient Prefer Adherence. 2012;6:369-388. doi:10.2147/PPA.S29715.</w:t>
+        <w:t xml:space="preserve">3. Al-Harbi KS. Treatment-resistant depression: therapeutic trends, challenges, and future directions. Patient Prefer Adherence. 2012;6:369-388. doi:10.2147/PPA.S29716.</w:t>
       </w:r>
     </w:p>
     <w:p>
@@ -4632,7 +4641,7 @@
         <w:pStyle w:val="BodyText"/>
       </w:pPr>
       <w:r>
-        <w:t xml:space="preserve">7. Chekroud AM, Zotti RJ, Shehzad Z, Gueorguieva R, Johnson MK, Trivedi MH, et al. Cross-trial prediction of treatment outcome in depression: a machine learning approach. Lancet Psychiatry. 2016;3(3):243-250. doi:10.1016/S2214-0366(15)00471-X.</w:t>
+        <w:t xml:space="preserve">7. Chekroud AM, Zotti RJ, Shehzad Z, Gueorguieva R, Johnson MK, Trivedi MH, et al. Cross-trial prediction of treatment outcome in depression: a machine learning approach. Lancet Psychiatry. 2016;3(3):243-250. doi:10.1016/S2215-0366(15)00471-X.</w:t>
       </w:r>
     </w:p>
     <w:p>
@@ -4712,7 +4721,7 @@
         <w:pStyle w:val="BodyText"/>
       </w:pPr>
       <w:r>
-        <w:t xml:space="preserve">17. Shmatko A, Jung AW, Gaurav K, Brunak S, Mortensen LH, Birney E, et al. Learning the natural history of human disease with generative transformers. Nature. 2025;647(8082):248-256. doi:10.1038/s41586-025-09529-3.</w:t>
+        <w:t xml:space="preserve">17. Shmatko A, Jung AW, Gaurav K, Brunak S, Mortensen LH, Birney E, et al. Learning the natural history of human disease with generative transformers. Nature. 2025;647(8088):248-256. doi:10.1038/s41586-025-09529-3.</w:t>
       </w:r>
     </w:p>
     <w:p>
@@ -4811,7 +4820,23 @@
         <w:t xml:space="preserve">29. Alegría M, Chatterji P, Wells K, Cao Z, Chen CN, Takeuchi D, et al. Disparity in depression treatment among racial and ethnic minority populations in the United States. Psychiatr Serv. 2008;59(11):1264-1272. doi:10.1176/ps.2008.59.11.1264.</w:t>
       </w:r>
     </w:p>
-    <w:bookmarkEnd w:id="60"/>
+    <w:p>
+      <w:pPr>
+        <w:pStyle w:val="BodyText"/>
+      </w:pPr>
+      <w:r>
+        <w:t xml:space="preserve">30. Goldberger J, Roweis S, Hinton G, Salakhutdinov R. Neighbourhood components analysis. In: Saul LK, Weiss Y, Bottou L, editors. Advances in Neural Information Processing Systems 17 (NIPS 2004). Cambridge (MA): MIT Press; 2005. URL: https://proceedings.neurips.cc/paper/2004/hash/42fe880812925e520249e808937738d2-Abstract.html</w:t>
+      </w:r>
+    </w:p>
+    <w:p>
+      <w:pPr>
+        <w:pStyle w:val="BodyText"/>
+      </w:pPr>
+      <w:r>
+        <w:t xml:space="preserve">31. Cawley GC, Talbot NLC. On over-fitting in model selection and subsequent selection bias in performance evaluation. J Mach Learn Res. 2010;11:2079-2107.</w:t>
+      </w:r>
+    </w:p>
+    <w:bookmarkEnd w:id="70"/>
     <w:sectPr>
       <w:pgSz w:h="15840" w:w="12240"/>
       <w:pgMar w:bottom="1440" w:footer="708" w:gutter="0" w:header="708" w:left="1800" w:right="1800" w:top="1440"/>

</xml_diff>

<commit_message>
TRD-EHR paper 1: the narratives are template-generated, not rule-based, in the abstract's Objective, the Introduction and the cover letter, so RULES.md's banned word leaves the packet; manuscript, cover letter and parts rebuilt
</commit_message>
<xml_diff>
--- a/projects/TRD-EHR/paper1-trd-prediction/manuscript.docx
+++ b/projects/TRD-EHR/paper1-trd-prediction/manuscript.docx
@@ -194,7 +194,7 @@
         <w:t xml:space="preserve"> </w:t>
       </w:r>
       <w:r>
-        <w:t xml:space="preserve">We compared structured feature vectors with pretrained embeddings of rule-based patient narratives for predicting a treatment-switching proxy for TRD at the index antidepressant prescription.</w:t>
+        <w:t xml:space="preserve">We compared structured feature vectors with pretrained embeddings of template-generated patient narratives for predicting a treatment-switching proxy for TRD at the index antidepressant prescription.</w:t>
       </w:r>
     </w:p>
     <w:p>
@@ -306,7 +306,7 @@
         <w:pStyle w:val="BodyText"/>
       </w:pPr>
       <w:r>
-        <w:t xml:space="preserve">We asked whether pretrained embeddings of rule-based patient narratives improve prediction of a treatment-switching proxy for TRD beyond structured feature vectors at the index antidepressant prescription. We compared the pipelines in the same patients, using a common temporal design and test set. Secondary analyses examined whether performance depended on the classifier or encoder, which clinical domains contributed, and whether embedding similarity supported prediction.</w:t>
+        <w:t xml:space="preserve">We asked whether pretrained embeddings of template-generated patient narratives improve prediction of a treatment-switching proxy for TRD beyond structured feature vectors at the index antidepressant prescription. We compared the pipelines in the same patients, using a common temporal design and test set. Secondary analyses examined whether performance depended on the classifier or encoder, which clinical domains contributed, and whether embedding similarity supported prediction.</w:t>
       </w:r>
     </w:p>
     <w:bookmarkEnd w:id="24"/>

</xml_diff>

<commit_message>
TRD-EHR paper 1: no encoder is called primary; each place names Qwen3-Embedding-8B, and Methods says once that results naming no encoder are for it; Methods trims 8 words so it stays under its earlier length; packet and parts rebuilt
</commit_message>
<xml_diff>
--- a/projects/TRD-EHR/paper1-trd-prediction/manuscript.docx
+++ b/projects/TRD-EHR/paper1-trd-prediction/manuscript.docx
@@ -212,7 +212,7 @@
         <w:t xml:space="preserve"> </w:t>
       </w:r>
       <w:r>
-        <w:t xml:space="preserve">This retrospective study included 42,579 patients with depression from one community health system. The outcome required at least 3 distinct antidepressant treatments, including the index agent, within 365 days. Clinical predictors were derived from a 730-day lookback window. We evaluated 4 classifiers on each representation using a shared 80:20 training and test split, with preprocessing and tuning confined to training data. Four embedding encoders were evaluated; Qwen3-Embedding-8B was primary. The pipelines used the same source records. We assessed discrimination, calibration, and paired bootstrap differences, and used concept permutation and neighbor retrieval to examine the predictive signal.</w:t>
+        <w:t xml:space="preserve">This retrospective study included 42,579 patients with depression from one community health system. The outcome required at least 3 distinct antidepressant treatments, including the index agent, within 365 days. Clinical predictors were derived from a 730-day lookback window. We evaluated 4 classifiers on each representation using a shared 80:20 training and test split, with preprocessing and tuning confined to training data. Four embedding encoders were evaluated; results that name no encoder are for Qwen3-Embedding-8B. The pipelines used the same source records. We assessed discrimination, calibration, and paired bootstrap differences, and used concept permutation and neighbor retrieval to examine the predictive signal.</w:t>
       </w:r>
     </w:p>
     <w:p>
@@ -230,7 +230,7 @@
         <w:t xml:space="preserve"> </w:t>
       </w:r>
       <w:r>
-        <w:t xml:space="preserve">The outcome occurred in 7,455 patients (17.5%, 95% CI 17.2–17.9). In 8,516 test patients, embedded logistic regression achieved a receiver operating characteristic area under the curve (ROC AUC) of 0.657 (95% CI 0.643–0.672), compared with 0.649 (95% CI 0.634–0.664) for feature-vector XGBoost. The post hoc difference between these leading models was 0.008 (95% CI −0.003 to 0.019). Embeddings improved logistic regression by 0.028 (95% CI 0.017–0.039) but reduced discrimination for the 3 tree ensembles, by 0.013 (95% CI 0.001–0.026) to 0.022 (95% CI 0.011–0.033). Across encoders, embedded logistic regression reached 0.645 (95% CI 0.629–0.660) to 0.657 (95% CI 0.643–0.672). Permuting psychiatric history produced the largest loss for the primary encoder, 0.024 (95% CI 0.010–0.036) to 0.028 (95% CI 0.017–0.039) across classifiers; medication burden and prior treatment exposure also contributed. Permuting race/ethnicity or recorded social determinants changed ROC AUC by no more than 0.003, and every such interval included zero. Nearest-neighbor retrieval, scored at every neighborhood size from 1 to 34,063, stayed below both leading classifiers at every size. Its maximum at similarity exponent 1, 0.625 (95% CI 0.610–0.641) for logistic-regression-weighted retrieval, was read at a size chosen on the test patients and is optimistic. Randomly chosen neighbors stayed at chance, at most 0.500 (2.5th–97.5th percentile across draws 0.484–0.515).</w:t>
+        <w:t xml:space="preserve">The outcome occurred in 7,455 patients (17.5%, 95% CI 17.2–17.9). In 8,516 test patients, embedded logistic regression achieved a receiver operating characteristic area under the curve (ROC AUC) of 0.657 (95% CI 0.643–0.672), compared with 0.649 (95% CI 0.634–0.664) for feature-vector XGBoost. The post hoc difference between these leading models was 0.008 (95% CI −0.003 to 0.019). Embeddings improved logistic regression by 0.028 (95% CI 0.017–0.039) but reduced discrimination for the 3 tree ensembles, by 0.013 (95% CI 0.001–0.026) to 0.022 (95% CI 0.011–0.033). Across encoders, embedded logistic regression reached 0.645 (95% CI 0.629–0.660) to 0.657 (95% CI 0.643–0.672). Permuting psychiatric history produced the largest loss for Qwen3-Embedding-8B, 0.024 (95% CI 0.010–0.036) to 0.028 (95% CI 0.017–0.039) across classifiers; medication burden and prior treatment exposure also contributed. Permuting race/ethnicity or recorded social determinants changed ROC AUC by no more than 0.003, and every such interval included zero. Nearest-neighbor retrieval, scored at every neighborhood size from 1 to 34,063, stayed below both leading classifiers at every size. Its maximum at similarity exponent 1, 0.625 (95% CI 0.610–0.641) for logistic-regression-weighted retrieval, was read at a size chosen on the test patients and is optimistic. Randomly chosen neighbors stayed at chance, at most 0.500 (2.5th–97.5th percentile across draws 0.484–0.515).</w:t>
       </w:r>
     </w:p>
     <w:p>
@@ -341,7 +341,7 @@
         <w:pStyle w:val="BodyText"/>
       </w:pPr>
       <w:r>
-        <w:t xml:space="preserve">We used data version DV260629v1 and patient version PV260710v1, extracted on June 29, 2026, and processed on July 10, 2026. Index dates spanned 2013–2025. Evaluation used a random internal split from the same source and period. Source definitions and sampling details are provided in Multimedia Appendix 1, sections M1–M2. We used TRIPOD+AI to guide reporting [19].</w:t>
+        <w:t xml:space="preserve">We used data version DV260629v1 and patient version PV260710v1, extracted on June 29, 2026, and processed on July 10, 2026. Index dates spanned 2013–2025. Evaluation used a random internal split from the same source and period. Source definitions and sampling details are in Multimedia Appendix 1, sections M1–M2. We used TRIPOD+AI to guide reporting [19].</w:t>
       </w:r>
     </w:p>
     <w:bookmarkEnd w:id="25"/>
@@ -506,7 +506,7 @@
         <w:pStyle w:val="BodyText"/>
       </w:pPr>
       <w:r>
-        <w:t xml:space="preserve">For the embedded representation (EMBEDDED), fixed rules converted structured fields into Markdown narratives. No generative model wrote the narratives, preserving traceability to the source fields [21]. We evaluated bge-small-en-v1.5, bge-en-icl, Qwen3-Embedding-4B, and Qwen3-Embedding-8B; the last was the primary encoder [22-25].</w:t>
+        <w:t xml:space="preserve">For the embedded representation (EMBEDDED), fixed rules converted structured fields into Markdown narratives. No generative model wrote the narratives, preserving traceability to the source fields [21]. We evaluated bge-small-en-v1.5, bge-en-icl, Qwen3-Embedding-4B, and Qwen3-Embedding-8B [22-25]. Results that name no encoder are for Qwen3-Embedding-8B.</w:t>
       </w:r>
     </w:p>
     <w:p>
@@ -1514,15 +1514,15 @@
         <w:t xml:space="preserve"> </w:t>
       </w:r>
       <w:r>
-        <w:t xml:space="preserve">is a sharpening exponent. Plain cosine similarity is Equation 1 with raw embeddings and equal weights. Neighbors were chosen in 2 ways, nearest and random. Random retrieval averaged the outcomes of k training patients drawn at random, with equal weights, in 1,000 seeded draws; its interval is the 2.5th to 97.5th percentile across draws. Both were scored at every k from 1 to all 34,063 training patients, nearest retrieval under α = 1, 2, and 5. Each retrieval arm, the 2 nearest-neighbor metrics and random retrieval, therefore yields a curve over k, not a value at one k. Apart from those curves, every performance value reported for a retrieval arm is at that arm’s best k, the k with the highest ROC AUC in the test patients, except where a fixed k is named. That includes ROC curves, confusion matrices, maxima, and the AUPRC, Brier and calibration summaries. Because that k was chosen on the test patients, these values are optimistic. Details appear in Multimedia Appendix 1, sections M10–M12 and S6.</w:t>
-      </w:r>
-    </w:p>
-    <w:p>
-      <w:pPr>
-        <w:pStyle w:val="BodyText"/>
-      </w:pPr>
-      <w:r>
-        <w:t xml:space="preserve">Additional analyses examined encoder robustness, model dimensionality, record length, and subgroup performance. Subgroup comparisons, for the primary encoder, used held-out predictions without refitting and Benjamini–Hochberg adjustment across 240 contrasts. Full methods and results appear in Multimedia Appendix 1. All random processes were seeded; analyses used Python, scikit-learn, XGBoost, and sentence-transformers [22,26,27].</w:t>
+        <w:t xml:space="preserve">is a sharpening exponent. Plain cosine similarity is Equation 1 with raw embeddings and equal weights. Neighbors were chosen in 2 ways, nearest and random. Random retrieval averaged the outcomes of k training patients drawn at random, with equal weights, in 1,000 seeded draws; its interval is the 2.5th to 97.5th percentile across draws. Both were scored at every k from 1 to all 34,063 training patients, nearest retrieval under α = 1, 2, and 5. Each retrieval arm therefore yields a curve over k, not a value at one k. Apart from those curves, every performance value reported for a retrieval arm is at that arm’s best k, the k with the highest ROC AUC in the test patients, except where a fixed k is named. That includes ROC curves, confusion matrices, maxima, and the AUPRC, Brier and calibration summaries. Because that k was chosen on the test patients, these values are optimistic. Details appear in Multimedia Appendix 1, sections M10–M12 and S6.</w:t>
+      </w:r>
+    </w:p>
+    <w:p>
+      <w:pPr>
+        <w:pStyle w:val="BodyText"/>
+      </w:pPr>
+      <w:r>
+        <w:t xml:space="preserve">Additional analyses examined encoder robustness, model dimensionality, record length, and subgroup performance. Subgroup comparisons, for Qwen3-Embedding-8B, used held-out predictions without refitting and Benjamini–Hochberg adjustment across 240 contrasts. Full methods and results appear in Multimedia Appendix 1. All random processes were seeded; analyses used Python, scikit-learn, XGBoost, and sentence-transformers [22,26,27].</w:t>
       </w:r>
     </w:p>
     <w:bookmarkEnd w:id="33"/>
@@ -3400,7 +3400,7 @@
         <w:pStyle w:val="FirstParagraph"/>
       </w:pPr>
       <w:r>
-        <w:t xml:space="preserve">For the primary encoder, permuting psychiatric history reduced ROC AUC by 0.024 (95% CI 0.010–0.036) to 0.028 (95% CI 0.017–0.039) across classifiers, with all paired CIs excluding zero. For embedded logistic regression, medication burden and prior treatment exposure reduced ROC AUC by 0.027 (95% CI 0.018–0.037) and 0.019 (95% CI 0.011–0.027), respectively. Permuting race/ethnicity or recorded social determinants changed ROC AUC by no more than 0.003, and every such interval included zero (Table 3). These results describe direct input reliance under the tested perturbations.</w:t>
+        <w:t xml:space="preserve">For Qwen3-Embedding-8B, permuting psychiatric history reduced ROC AUC by 0.024 (95% CI 0.010–0.036) to 0.028 (95% CI 0.017–0.039) across classifiers, with all paired CIs excluding zero. For embedded logistic regression, medication burden and prior treatment exposure reduced ROC AUC by 0.027 (95% CI 0.018–0.037) and 0.019 (95% CI 0.011–0.027), respectively. Permuting race/ethnicity or recorded social determinants changed ROC AUC by no more than 0.003, and every such interval included zero (Table 3). These results describe direct input reliance under the tested perturbations.</w:t>
       </w:r>
     </w:p>
     <w:p>
@@ -3966,7 +3966,7 @@
         <w:pStyle w:val="FirstParagraph"/>
       </w:pPr>
       <w:r>
-        <w:t xml:space="preserve">Retrieval is reported as a curve over neighborhood size (Figure 4D for the primary encoder). At every k from 1 to 34,063, both nearest-neighbor metrics stayed below both leading classifiers, and random retrieval stayed at chance. Neighborhood size mattered more than the similarity metric. Discrimination rose with k up to a few hundred neighbors. From k = 261 onward, logistic-regression-weighted retrieval stayed inside the interval at its best k. Plain cosine retrieval peaked and then drifted down, to 0.605 (95% CI 0.589–0.620) at k = 16,988. Each arm’s maximum was read at its best k, chosen on the test patients, so these maxima are optimistic. Logistic-regression-weighted retrieval reached 0.625 (95% CI 0.610–0.641) at k = 295, plain cosine 0.618 (95% CI 0.602–0.634) at k = 757, and random retrieval 0.500 (2.5th–97.5th percentile across draws 0.484–0.515) at k = 32,720, a best k that is noise. The 2 nearest-neighbor metrics exceeded random retrieval by 0.125 (95% CI 0.103–0.147) and 0.118 (95% CI 0.096–0.140), respectively, and differed from each other by 0.007 (95% CI −0.001 to 0.014). The best retrieval result over every k and exponent was logistic-regression-weighted retrieval with α = 2 at k = 1,090, 0.625 (95% CI 0.610–0.640). It was still lower than feature-vector XGBoost by 0.024 (95% CI 0.012–0.036) and lower than embedded logistic regression by 0.032 (95% CI 0.022–0.043). Using all 34,063 training patients as neighbors, with no k chosen, gave 0.624 (95% CI 0.607–0.639) for logistic-regression-weighted retrieval and 0.608 (95% CI 0.592–0.624) for plain cosine. These stay above chance because each neighbor’s vote is weighted by its similarity, so the same 34,063 neighbors are weighed differently for each patient. With equal weights, every patient would get the same score and ROC AUC would be exactly 0.5, which is what random retrieval gave at k = 34,063. ROC curves and confusion matrices at each arm’s best k are in Multimedia Appendix 1, section S6.</w:t>
+        <w:t xml:space="preserve">Retrieval is reported as a curve over neighborhood size (Figure 4D for Qwen3-Embedding-8B). At every k from 1 to 34,063, both nearest-neighbor metrics stayed below both leading classifiers, and random retrieval stayed at chance. Neighborhood size mattered more than the similarity metric. Discrimination rose with k up to a few hundred neighbors. From k = 261 onward, logistic-regression-weighted retrieval stayed inside the interval at its best k. Plain cosine retrieval peaked and then drifted down, to 0.605 (95% CI 0.589–0.620) at k = 16,988. Each arm’s maximum was read at its best k, chosen on the test patients, so these maxima are optimistic. Logistic-regression-weighted retrieval reached 0.625 (95% CI 0.610–0.641) at k = 295, plain cosine 0.618 (95% CI 0.602–0.634) at k = 757, and random retrieval 0.500 (2.5th–97.5th percentile across draws 0.484–0.515) at k = 32,720, a best k that is noise. The 2 nearest-neighbor metrics exceeded random retrieval by 0.125 (95% CI 0.103–0.147) and 0.118 (95% CI 0.096–0.140), respectively, and differed from each other by 0.007 (95% CI −0.001 to 0.014). The best retrieval result over every k and exponent was logistic-regression-weighted retrieval with α = 2 at k = 1,090, 0.625 (95% CI 0.610–0.640). It was still lower than feature-vector XGBoost by 0.024 (95% CI 0.012–0.036) and lower than embedded logistic regression by 0.032 (95% CI 0.022–0.043). Using all 34,063 training patients as neighbors, with no k chosen, gave 0.624 (95% CI 0.607–0.639) for logistic-regression-weighted retrieval and 0.608 (95% CI 0.592–0.624) for plain cosine. These stay above chance because each neighbor’s vote is weighted by its similarity, so the same 34,063 neighbors are weighed differently for each patient. With equal weights, every patient would get the same score and ROC AUC would be exactly 0.5, which is what random retrieval gave at k = 34,063. ROC curves and confusion matrices at each arm’s best k are in Multimedia Appendix 1, section S6.</w:t>
       </w:r>
     </w:p>
     <w:p>
@@ -4041,7 +4041,7 @@
           <w:i/>
           <w:iCs/>
         </w:rPr>
-        <w:t xml:space="preserve">Retrieval discrimination by neighborhood size for the 4 encoders: (A) bge-small-en-v1.5, (B) bge-en-icl, (C) Qwen3-Embedding-4B, and (D) Qwen3-Embedding-8B, the primary encoder. Each panel title gives the encoder’s number of embedding dimensions. Each panel draws ROC AUC in 8,516 test patients at every k from 1 to 34,063. Lines are the retrieval arms: logistic-regression-weighted and plain cosine retrieval with bootstrap 95% bands, and random retrieval with uniform weights, as the mean across 1,000 draws within the 2.5th–97.5th percentile of the draws. Each encoder’s weights come from its own embedded logistic regression. Random retrieval does not use the embedding, so it is the same in every panel. Diamonds mark each arm’s best k, chosen on the test patients, so the values there are optimistic; the random arm’s best k is noise. Each panel’s best-k values are listed beneath it. Horizontal lines mark that encoder’s embedded logistic regression and feature-vector XGBoost, which is the same in every panel. Curves use α = 1; for the primary encoder, the maxima under α = 1, 2, and 5 agreed within 0.002.</w:t>
+        <w:t xml:space="preserve">Retrieval discrimination by neighborhood size for the 4 encoders: (A) bge-small-en-v1.5, (B) bge-en-icl, (C) Qwen3-Embedding-4B, and (D) Qwen3-Embedding-8B. Each panel title gives the encoder’s number of embedding dimensions. Each panel draws ROC AUC in 8,516 test patients at every k from 1 to 34,063. Lines are the retrieval arms: logistic-regression-weighted and plain cosine retrieval with bootstrap 95% bands, and random retrieval with uniform weights, as the mean across 1,000 draws within the 2.5th–97.5th percentile of the draws. Each encoder’s weights come from its own embedded logistic regression. Random retrieval does not use the embedding, so it is the same in every panel. Diamonds mark each arm’s best k, chosen on the test patients, so the values there are optimistic; the random arm’s best k is noise. Each panel’s best-k values are listed beneath it. Horizontal lines mark that encoder’s embedded logistic regression and feature-vector XGBoost, which is the same in every panel. Curves use α = 1; for Qwen3-Embedding-8B, the maxima under α = 1, 2, and 5 agreed within 0.002.</w:t>
       </w:r>
     </w:p>
     <w:bookmarkEnd w:id="48"/>
@@ -4067,15 +4067,15 @@
         <w:pStyle w:val="BodyText"/>
       </w:pPr>
       <w:r>
-        <w:t xml:space="preserve">Logistic-regression-weighted retrieval at its best k reached 0.606 (95% CI 0.590–0.620) at k = 579 for bge-small-en-v1.5, 0.631 (95% CI 0.616–0.646) at k = 1,519 for bge-en-icl, 0.623 (95% CI 0.607–0.639) at k = 684 for Qwen3-Embedding-4B, and 0.625 (95% CI 0.610–0.641) at k = 295 for Qwen3-Embedding-8B. Embedded logistic regression reached 0.645 (95% CI 0.629–0.660), 0.655 (95% CI 0.641–0.670), 0.655 (95% CI 0.641–0.670), and 0.657 (95% CI 0.643–0.672) for the same encoders. For each encoder, the upper bound of the retrieval interval lay below the logistic-regression estimate. Paired contrasts were computed for the primary encoder only.</w:t>
-      </w:r>
-    </w:p>
-    <w:p>
-      <w:pPr>
-        <w:pStyle w:val="BodyText"/>
-      </w:pPr>
-      <w:r>
-        <w:t xml:space="preserve">Plain cosine retrieval peaked at k = 1,243, 413, 493, and 757 for the same 4 encoders. It reached 0.602 (95% CI 0.586–0.618), 0.620 (95% CI 0.605–0.637), 0.621 (95% CI 0.605–0.637), and 0.618 (95% CI 0.602–0.634), lower than the weighted metric for every encoder. Only the primary encoder’s difference was tested, 0.007 (95% CI −0.001 to 0.014), and its interval includes zero. Agreement in direction across 4 encoders does not show that weighting helps, because each maximum was read at its own best k. Every best k for either metric lay between 295 and 1,519. Using all 34,063 training patients as neighbors, weighted retrieval gave 0.617 (95% CI 0.600–0.633) to 0.629 (95% CI 0.614–0.645) for the 3 larger encoders. For bge-small-en-v1.5 it fell to 0.580 (95% CI 0.565–0.595), the steepest decline of any encoder’s weighted curve at large k. Near the whole pool (k above about 30,500), every patient’s neighborhood is nearly the same set, so the risk estimates differ by about 0.0004 (risk SD 4.00 × 10⁻⁴ at bge-small-en-v1.5’s lowest point, k = 31,447), and plain cosine ROC AUC becomes unstable, ranging from 0.511 to 0.582 for bge-small-en-v1.5 and from 0.579 to 0.606 for bge-en-icl, with no change to any conclusion. ROC curves and confusion matrices for each encoder’s nearest-neighbor metrics at their best k are in Multimedia Appendix 1, section S6.</w:t>
+        <w:t xml:space="preserve">Logistic-regression-weighted retrieval at its best k reached 0.606 (95% CI 0.590–0.620) at k = 579 for bge-small-en-v1.5, 0.631 (95% CI 0.616–0.646) at k = 1,519 for bge-en-icl, 0.623 (95% CI 0.607–0.639) at k = 684 for Qwen3-Embedding-4B, and 0.625 (95% CI 0.610–0.641) at k = 295 for Qwen3-Embedding-8B. Embedded logistic regression reached 0.645 (95% CI 0.629–0.660), 0.655 (95% CI 0.641–0.670), 0.655 (95% CI 0.641–0.670), and 0.657 (95% CI 0.643–0.672) for the same encoders. For each encoder, the upper bound of the retrieval interval lay below the logistic-regression estimate. Paired contrasts were computed for Qwen3-Embedding-8B only.</w:t>
+      </w:r>
+    </w:p>
+    <w:p>
+      <w:pPr>
+        <w:pStyle w:val="BodyText"/>
+      </w:pPr>
+      <w:r>
+        <w:t xml:space="preserve">Plain cosine retrieval peaked at k = 1,243, 413, 493, and 757 for the same 4 encoders. It reached 0.602 (95% CI 0.586–0.618), 0.620 (95% CI 0.605–0.637), 0.621 (95% CI 0.605–0.637), and 0.618 (95% CI 0.602–0.634), lower than the weighted metric for every encoder. Only Qwen3-Embedding-8B’s difference was tested, 0.007 (95% CI −0.001 to 0.014), and its interval includes zero. Agreement in direction across 4 encoders does not show that weighting helps, because each maximum was read at its own best k. Every best k for either metric lay between 295 and 1,519. Using all 34,063 training patients as neighbors, weighted retrieval gave 0.617 (95% CI 0.600–0.633) to 0.629 (95% CI 0.614–0.645) for the 3 larger encoders. For bge-small-en-v1.5 it fell to 0.580 (95% CI 0.565–0.595), the steepest decline of any encoder’s weighted curve at large k. Near the whole pool (k above about 30,500), every patient’s neighborhood is nearly the same set, so the risk estimates differ by about 0.0004 (risk SD 4.00 × 10⁻⁴ at bge-small-en-v1.5’s lowest point, k = 31,447), and plain cosine ROC AUC becomes unstable, ranging from 0.511 to 0.582 for bge-small-en-v1.5 and from 0.579 to 0.606 for bge-en-icl, with no change to any conclusion. ROC curves and confusion matrices for each encoder’s nearest-neighbor metrics at their best k are in Multimedia Appendix 1, section S6.</w:t>
       </w:r>
     </w:p>
     <w:p>
@@ -4109,7 +4109,7 @@
         <w:pStyle w:val="FirstParagraph"/>
       </w:pPr>
       <w:r>
-        <w:t xml:space="preserve">Subgroup analyses covered all 8 classifiers and both nearest-neighbor arms, for the primary encoder; each retrieval arm was scored at its best k. Each contrast compared one group’s ROC AUC with that of all other test patients, for the same model. The groups were of 2 kinds. Sociodemographic groups (sex, race, age, marital status, smoking, and religion) ask whether the models work equally well for different people. Clinical groups (MDD recurrence and severity) ask whether they work equally well across ways the illness was recorded.</w:t>
+        <w:t xml:space="preserve">Subgroup analyses covered all 8 classifiers and both nearest-neighbor arms, for Qwen3-Embedding-8B; each retrieval arm was scored at its best k. Each contrast compared one group’s ROC AUC with that of all other test patients, for the same model. The groups were of 2 kinds. Sociodemographic groups (sex, race, age, marital status, smoking, and religion) ask whether the models work equally well for different people. Clinical groups (MDD recurrence and severity) ask whether they work equally well across ways the illness was recorded.</w:t>
       </w:r>
     </w:p>
     <w:p>
@@ -4200,7 +4200,7 @@
           <w:i/>
           <w:iCs/>
         </w:rPr>
-        <w:t xml:space="preserve">Subgroup contrasts that survived Benjamini–Hochberg adjustment across 240 contrasts, for the primary encoder. Each row is one model’s ROC AUC in the named group minus its ROC AUC in all other test patients, with a bootstrap 95% CI. Every model whose contrast survived is shown; the other 217 contrasts did not survive. Multimedia Appendix 1, section S9 gives discrimination and calibration within each subgroup for one model per approach and summarizes the sex and race contrasts. Clinical groups describe how depression was recorded; sociodemographic groups describe the patients. Group sizes and outcome counts are for the test patients. Retrieval arms are scored at their best k, chosen on the test patients. LR: logistic regression; MDD: major depressive disorder.</w:t>
+        <w:t xml:space="preserve">Subgroup contrasts that survived Benjamini–Hochberg adjustment across 240 contrasts, for Qwen3-Embedding-8B. Each row is one model’s ROC AUC in the named group minus its ROC AUC in all other test patients, with a bootstrap 95% CI. Every model whose contrast survived is shown; the other 217 contrasts did not survive. Multimedia Appendix 1, section S9 gives discrimination and calibration within each subgroup for one model per approach and summarizes the sex and race contrasts. Clinical groups describe how depression was recorded; sociodemographic groups describe the patients. Group sizes and outcome counts are for the test patients. Retrieval arms are scored at their best k, chosen on the test patients. LR: logistic regression; MDD: major depressive disorder.</w:t>
       </w:r>
     </w:p>
     <w:bookmarkEnd w:id="53"/>

</xml_diff>